<commit_message>
Lead protocol with Claude, bundle genbank-converter skill in repo
</commit_message>
<xml_diff>
--- a/GenBank_Protocol_DRAFT.docx
+++ b/GenBank_Protocol_DRAFT.docx
@@ -29,12 +29,12 @@
           <w:sz w:val="44"/>
           <w:szCs w:val="44"/>
         </w:rPr>
-        <w:t xml:space="preserve">GenBank Annotation Pipeline</w:t>
-      </w:r>
-    </w:p>
-    <w:p>
-      <w:pPr>
-        <w:spacing w:after="320"/>
+        <w:t xml:space="preserve">TableTurner</w:t>
+      </w:r>
+    </w:p>
+    <w:p>
+      <w:pPr>
+        <w:spacing w:after="80"/>
       </w:pPr>
       <w:r>
         <w:rPr>
@@ -42,7 +42,22 @@
           <w:sz w:val="26"/>
           <w:szCs w:val="26"/>
         </w:rPr>
-        <w:t xml:space="preserve">Baseline Protocol: Excel Template → Claude Skill → GenBank Submission File</w:t>
+        <w:t xml:space="preserve">Baseline Protocol: Excel Template → Claude → GenBank Submission File</w:t>
+      </w:r>
+    </w:p>
+    <w:p>
+      <w:pPr>
+        <w:spacing w:after="320"/>
+      </w:pPr>
+      <w:r>
+        <w:rPr>
+          <w:i/>
+          <w:iCs/>
+          <w:color w:val="1F4E78"/>
+          <w:sz w:val="20"/>
+          <w:szCs w:val="20"/>
+        </w:rPr>
+        <w:t xml:space="preserve">github.com/FeatureConvert/TableTurner</w:t>
       </w:r>
     </w:p>
     <w:p>
@@ -59,7 +74,7 @@
         <w:spacing w:after="160"/>
       </w:pPr>
       <w:r>
-        <w:t xml:space="preserve">This protocol describes how to take a finished gene/feature annotation for a sequenced genome (e.g. a phage genome after ORF calling, BLAST/InterPro annotation, and tRNA prediction) and turn it into a submission-ready file for NCBI, using a pre-built Excel template and a Claude “skill” (a saved set of instructions and scripts Claude can run on request). It picks up where the lab's existing sequencing/annotation protocol leaves off — after ORFs and features have been called and tracked in a spreadsheet, but before hand-typing a feature table.</w:t>
+        <w:t xml:space="preserve">This protocol describes how to take a finished gene/feature annotation for a sequenced genome (e.g. a phage genome after ORF calling, BLAST/InterPro annotation, and tRNA prediction) and turn it into a submission-ready file for NCBI, using TableTurner: a pre-built Excel template plus a small pair of conversion scripts, usable either by asking Claude to run them for you or from the command line yourself. It picks up where the lab's existing sequencing/annotation protocol leaves off — after ORFs and features have been called and tracked in a spreadsheet, but before hand-typing a feature table.</w:t>
       </w:r>
     </w:p>
     <w:p>
@@ -141,7 +156,7 @@
         <w:spacing w:after="80"/>
       </w:pPr>
       <w:r>
-        <w:t xml:space="preserve">Access to Claude in Cowork mode (or another Claude interface with file upload and a working folder), with the “genbank-converter” skill available on the account. This skill is already saved and loads automatically — you do not need to re-install or re-upload it each time, and you do not need to know Python to use it.</w:t>
+        <w:t xml:space="preserve">Either: access to Claude in Cowork mode (or another Claude interface with file upload and a working folder) — the “genbank-converter” skill ships inside the TableTurner repo itself (.claude/skills/genbank-converter/) and loads automatically for anyone using Claude with this repo folder open, no separate install step. Or: Python 3 with the openpyxl package, if you'd rather run the two scripts yourself from the command line (see section 4.2).</w:t>
       </w:r>
     </w:p>
     <w:p>
@@ -165,7 +180,7 @@
           <w:iCs/>
           <w:color w:val="555555"/>
         </w:rPr>
-        <w:t xml:space="preserve">If a teammate is doing this from a different Claude account and the skill doesn't trigger automatically, mention “convert this GenBank annotation template” in your request, or ask to have the genbank-converter skill shared/added to that account.</w:t>
+        <w:t xml:space="preserve">If Claude doesn't pick up the skill automatically (e.g. you're working outside this repo folder), just mention “convert this GenBank annotation template” in your request, or point Claude at the .claude/skills/genbank-converter/ folder directly.</w:t>
       </w:r>
     </w:p>
     <w:p>
@@ -784,7 +799,7 @@
                 <w:sz w:val="20"/>
                 <w:szCs w:val="20"/>
               </w:rPr>
-              <w:t xml:space="preserve">CDS, tRNA, rRNA, or misc_feature. Pick from the dropdown. (Don't add separate “gene” rows for CDS — see below.)</w:t>
+              <w:t xml:space="preserve">CDS, tRNA, rRNA, or misc_feature — occasionally “gene” for a standalone gene with no CDS. Pick from the dropdown. (Don't add separate “gene” rows for CDS — see below.)</w:t>
             </w:r>
           </w:p>
         </w:tc>
@@ -1188,7 +1203,24 @@
         <w:spacing w:after="160" w:before="320"/>
       </w:pPr>
       <w:r>
-        <w:t xml:space="preserve">4. Running the conversion in Claude</w:t>
+        <w:t xml:space="preserve">4. Running the conversion</w:t>
+      </w:r>
+    </w:p>
+    <w:p>
+      <w:pPr>
+        <w:spacing w:after="160"/>
+      </w:pPr>
+      <w:r>
+        <w:t xml:space="preserve">Two ways to do this — pick whichever fits. Option A is the recommended default for most lab use; Option B is there for anyone who'd rather not use Claude, or is scripting this as part of a larger pipeline.</w:t>
+      </w:r>
+    </w:p>
+    <w:p>
+      <w:pPr>
+        <w:pStyle w:val="Heading2"/>
+        <w:spacing w:after="120" w:before="240"/>
+      </w:pPr>
+      <w:r>
+        <w:t xml:space="preserve">4.1 Option A — Ask Claude (recommended)</w:t>
       </w:r>
     </w:p>
     <w:p>
@@ -1201,7 +1233,7 @@
         <w:spacing w:after="100"/>
       </w:pPr>
       <w:r>
-        <w:t xml:space="preserve">Open (or continue) a Cowork conversation with Claude, in a session that has access to the folder containing your filled workbook.</w:t>
+        <w:t xml:space="preserve">Open (or continue) a Cowork conversation with Claude, in a session that has access to the folder containing your filled workbook — ideally the TableTurner repo folder itself, so the genbank-converter skill loads automatically.</w:t>
       </w:r>
     </w:p>
     <w:p>
@@ -1319,6 +1351,59 @@
       </w:pPr>
       <w:r>
         <w:t xml:space="preserve">Ask Claude to save the output to your working folder, and confirm the file is there before closing the session.</w:t>
+      </w:r>
+    </w:p>
+    <w:p>
+      <w:pPr>
+        <w:pStyle w:val="Heading2"/>
+        <w:spacing w:after="120" w:before="240"/>
+      </w:pPr>
+      <w:r>
+        <w:t xml:space="preserve">4.2 Option B — Run the scripts yourself from the command line</w:t>
+      </w:r>
+    </w:p>
+    <w:p>
+      <w:pPr>
+        <w:spacing w:after="160"/>
+      </w:pPr>
+      <w:r>
+        <w:t xml:space="preserve">Requires Python 3 and the openpyxl package (pip install openpyxl). Both scripts live at the root of the TableTurner repo:</w:t>
+      </w:r>
+    </w:p>
+    <w:p>
+      <w:pPr>
+        <w:shd w:fill="F2F2F2" w:val="clear"/>
+        <w:spacing w:after="40"/>
+      </w:pPr>
+      <w:r>
+        <w:rPr>
+          <w:rFonts w:ascii="Courier New" w:cs="Courier New" w:eastAsia="Courier New" w:hAnsi="Courier New"/>
+          <w:sz w:val="20"/>
+          <w:szCs w:val="20"/>
+        </w:rPr>
+        <w:t xml:space="preserve">python3 xlsx_to_feature_table.py your_filled_template.xlsx output.tbl.txt</w:t>
+      </w:r>
+    </w:p>
+    <w:p>
+      <w:pPr>
+        <w:shd w:fill="F2F2F2" w:val="clear"/>
+        <w:spacing w:after="40"/>
+      </w:pPr>
+      <w:r>
+        <w:rPr>
+          <w:rFonts w:ascii="Courier New" w:cs="Courier New" w:eastAsia="Courier New" w:hAnsi="Courier New"/>
+          <w:sz w:val="20"/>
+          <w:szCs w:val="20"/>
+        </w:rPr>
+        <w:t xml:space="preserve">python3 xlsx_to_genbank.py your_filled_template.xlsx output.gb</w:t>
+      </w:r>
+    </w:p>
+    <w:p>
+      <w:pPr>
+        <w:spacing w:after="160"/>
+      </w:pPr>
+      <w:r>
+        <w:t xml:space="preserve">Each script prints any warnings straight to the terminal — read them the same way described in step 3 above before trusting the output.</w:t>
       </w:r>
     </w:p>
     <w:p>

</xml_diff>

<commit_message>
Add maintainer/science-contact info to README and protocol
</commit_message>
<xml_diff>
--- a/GenBank_Protocol_DRAFT.docx
+++ b/GenBank_Protocol_DRAFT.docx
@@ -1420,7 +1420,7 @@
         <w:spacing w:after="160"/>
       </w:pPr>
       <w:r>
-        <w:t xml:space="preserve">Before submitting anything to NCBI, spot-check the result:</w:t>
+        <w:t xml:space="preserve">Before submitting anything to NCBI, spot-check the result. Do this every time on your first several uses of the tool, regardless of whatever ongoing team review policy gets settled on separately — the checks below are quick and catch the most common issues before they reach BankIt:</w:t>
       </w:r>
     </w:p>
     <w:p>
@@ -1577,7 +1577,7 @@
         <w:spacing w:after="80"/>
       </w:pPr>
       <w:r>
-        <w:t xml:space="preserve">Decide whether a second reviewer should always spot-check the output before BankIt submission, or only for genomes above a certain size/complexity.</w:t>
+        <w:t xml:space="preserve">Baseline in place: verify output yourself on every early use regardless (section 5). Still open — whether a second reviewer should always spot-check before BankIt submission on an ongoing basis, or only for genomes above a certain size/complexity, once the tool's track record is established.</w:t>
       </w:r>
     </w:p>
     <w:p>
@@ -1590,7 +1590,7 @@
         <w:spacing w:after="80"/>
       </w:pPr>
       <w:r>
-        <w:t xml:space="preserve">Add a named contact/owner for updates to the template or the skill itself.</w:t>
+        <w:t xml:space="preserve">Resolved: Robert Houston maintains the tool itself — file issues or feature requests at github.com/FeatureConvert/TableTurner/issues. Dr. Kristin Parent is the contact for annotation/biology questions (product naming, partial calls, and similar science judgment calls), not tool mechanics.</w:t>
       </w:r>
     </w:p>
     <w:p>

</xml_diff>

<commit_message>
Finalize protocol doc, bump to v1.1.0
</commit_message>
<xml_diff>
--- a/GenBank_Protocol_DRAFT.docx
+++ b/GenBank_Protocol_DRAFT.docx
@@ -11,11 +11,11 @@
         <w:rPr>
           <w:b/>
           <w:bCs/>
-          <w:color w:val="C00000"/>
+          <w:color w:val="1F4E78"/>
           <w:sz w:val="20"/>
           <w:szCs w:val="20"/>
         </w:rPr>
-        <w:t xml:space="preserve">DRAFT — FOR REVIEW</w:t>
+        <w:t xml:space="preserve">Version 1.1 — August 3, 2026</w:t>
       </w:r>
     </w:p>
     <w:p>
@@ -1420,7 +1420,7 @@
         <w:spacing w:after="160"/>
       </w:pPr>
       <w:r>
-        <w:t xml:space="preserve">Before submitting anything to NCBI, spot-check the result. Do this every time on your first several uses of the tool, regardless of whatever ongoing team review policy gets settled on separately — the checks below are quick and catch the most common issues before they reach BankIt:</w:t>
+        <w:t xml:space="preserve">Before submitting anything to NCBI, spot-check the result — every time, not just while you're new to the tool. The person running the tool is responsible for reviewing its output before submission; a second reviewer is not required. The checks below are quick and catch the most common issues before they reach BankIt:</w:t>
       </w:r>
     </w:p>
     <w:p>
@@ -1551,7 +1551,7 @@
         <w:spacing w:after="160" w:before="320"/>
       </w:pPr>
       <w:r>
-        <w:t xml:space="preserve">8. Open questions for this draft</w:t>
+        <w:t xml:space="preserve">8. Decisions made during review</w:t>
       </w:r>
     </w:p>
     <w:p>
@@ -1564,7 +1564,7 @@
         <w:spacing w:after="80"/>
       </w:pPr>
       <w:r>
-        <w:t xml:space="preserve">Confirm the preferred locus_tag convention (current default: Name_gp{N}, matching this lab's own draft feature tables — note that NCBI's published records have sometimes shown Name_{N} without “gp” after their own processing).</w:t>
+        <w:t xml:space="preserve">Resolved: keep the current default locus_tag convention (Name_gp{N}, matching this lab's own draft feature tables) — confirmed with Dr. Parent, no change needed. Note: this convention may still need to be changed manually for other labs' or other workflows' own naming needs, since it isn't an NCBI requirement, just this lab's convention.</w:t>
       </w:r>
     </w:p>
     <w:p>
@@ -1577,7 +1577,7 @@
         <w:spacing w:after="80"/>
       </w:pPr>
       <w:r>
-        <w:t xml:space="preserve">Baseline in place: verify output yourself on every early use regardless (section 5). Still open — whether a second reviewer should always spot-check before BankIt submission on an ongoing basis, or only for genomes above a certain size/complexity, once the tool's track record is established.</w:t>
+        <w:t xml:space="preserve">Resolved: the tool's output should always be reviewed by the person running it (section 5) — a second reviewer is not required, on an ongoing basis or otherwise.</w:t>
       </w:r>
     </w:p>
     <w:p>
@@ -1606,7 +1606,7 @@
           <w:sz w:val="20"/>
           <w:szCs w:val="20"/>
         </w:rPr>
-        <w:t xml:space="preserve">— End of draft. Comments and corrections welcome before this is finalized. —</w:t>
+        <w:t xml:space="preserve">— End of protocol. Comments and corrections welcome via GitHub Issues. —</w:t>
       </w:r>
     </w:p>
     <w:sectPr>

</xml_diff>